<commit_message>
build(report): docx 去掉与正文重复的 Title 行
pandoc 的 --metadata title 会在首页第一行再打一遍标题，和 Markdown 里已有
的 H1 重复，交上去像笔误；改成只保留正文那一级标题。docx 重新生成后核验：
1 个 H1 / 11 个 H2 / 6 张表，正文与 Markdown 逐段对齐、0 片段丢失。
</commit_message>
<xml_diff>
--- a/docs/research/开题报告.docx
+++ b/docs/research/开题报告.docx
@@ -2,14 +2,6 @@
 <file path=word/document.xml><?xml version="1.0" encoding="utf-8"?>
 <w:document xmlns:w="http://schemas.openxmlformats.org/wordprocessingml/2006/main" xmlns:m="http://schemas.openxmlformats.org/officeDocument/2006/math" xmlns:r="http://schemas.openxmlformats.org/officeDocument/2006/relationships" xmlns:o="urn:schemas-microsoft-com:office:office" xmlns:v="urn:schemas-microsoft-com:vml" xmlns:w10="urn:schemas-microsoft-com:office:word" xmlns:a="http://schemas.openxmlformats.org/drawingml/2006/main" xmlns:pic="http://schemas.openxmlformats.org/drawingml/2006/picture" xmlns:wp="http://schemas.openxmlformats.org/drawingml/2006/wordprocessingDrawing">
   <w:body>
-    <w:p>
-      <w:pPr>
-        <w:pStyle w:val="Title"/>
-      </w:pPr>
-      <w:r>
-        <w:t xml:space="preserve">赶梗潮 开题报告</w:t>
-      </w:r>
-    </w:p>
     <w:p>
       <w:pPr>
         <w:pStyle w:val="Heading1"/>
@@ -3612,7 +3604,7 @@
     </w:lvl>
   </w:abstractNum>
   <w:abstractNum w:abstractNumId="990">
-    <w:nsid w:val="1f8804fe"/>
+    <w:nsid w:val="b9d81290"/>
     <w:multiLevelType w:val="multilevel"/>
     <w:lvl w:ilvl="0">
       <w:numFmt w:val="bullet"/>
@@ -3693,7 +3685,7 @@
     </w:lvl>
   </w:abstractNum>
   <w:abstractNum w:abstractNumId="99411">
-    <w:nsid w:val="b8b53ab4"/>
+    <w:nsid w:val="f08b5da9"/>
     <w:multiLevelType w:val="multilevel"/>
     <w:lvl w:ilvl="0">
       <w:start w:val="1"/>
@@ -3781,7 +3773,7 @@
     </w:lvl>
   </w:abstractNum>
   <w:abstractNum w:abstractNumId="991">
-    <w:nsid w:val="ab5e2aa9"/>
+    <w:nsid w:val="9acc0ec5"/>
     <w:multiLevelType w:val="multilevel"/>
     <w:lvl w:ilvl="0">
       <w:numFmt w:val="bullet"/>

</xml_diff>